<commit_message>
Correct the source reference to Document 3, page 8, section 4
Page 8 falls within Document 3, the extract from the board strategy
day, which spans pages 6 to 9. "How we approach investment decisions"
is section 4 of that document, not Document 4. Document 4 is the draft
information memorandum and begins on page 10.

Co-Authored-By: Claude Opus 5 <noreply@anthropic.com>
Claude-Session: https://claude.ai/code/session_01SvXj76DdTNWmjbTHo7jSVU
</commit_message>
<xml_diff>
--- a/research/Axion-FM-Page8-Additions-for-Review.docx
+++ b/research/Axion-FM-Page8-Additions-for-Review.docx
@@ -11,7 +11,7 @@
         <w:rPr>
           <w:rFonts w:ascii="Aptos" w:hAnsi="Aptos"/>
         </w:rPr>
-        <w:t>Additions for review — Document 4, page 8</w:t>
+        <w:t>Additions for review — Document 3, page 8, section 4</w:t>
       </w:r>
     </w:p>
     <w:p>
@@ -25,7 +25,7 @@
           <w:i w:val="0"/>
           <w:sz w:val="18"/>
         </w:rPr>
-        <w:t>How we approach investment decisions. Each section below is drafted separately so it can be reviewed and placed where it fits best. The grey line under each heading states where it was drafted to sit.</w:t>
+        <w:t>"How we approach investment decisions", from the extract of the board strategy day. Each section below is drafted separately so it can be reviewed and placed where it fits best. The grey line under each heading states where it was drafted to sit.</w:t>
       </w:r>
     </w:p>
     <w:p>
@@ -4521,7 +4521,7 @@
         <w:rPr>
           <w:rFonts w:ascii="Aptos" w:hAnsi="Aptos"/>
         </w:rPr>
-        <w:t>8.  Critique of the approach in Document 4</w:t>
+        <w:t>8.  Critique of the approach in Document 3</w:t>
       </w:r>
     </w:p>
     <w:p>

</xml_diff>